<commit_message>
Hallazgos 2.0, CFA y .zip
</commit_message>
<xml_diff>
--- a/fuentes/CF3_63310033_DI.docx
+++ b/fuentes/CF3_63310033_DI.docx
@@ -194,29 +194,7 @@
                 <w:bCs/>
                 <w:color w:val="auto"/>
               </w:rPr>
-              <w:t xml:space="preserve">Aplicar metodologías </w:t>
-            </w:r>
-            <w:proofErr w:type="spellStart"/>
-            <w:r>
-              <w:rPr>
-                <w:rStyle w:val="fontstyle01"/>
-                <w:rFonts w:ascii="Arial" w:hAnsi="Arial"/>
-                <w:b w:val="0"/>
-                <w:bCs/>
-                <w:color w:val="auto"/>
-              </w:rPr>
-              <w:t>valuatorias</w:t>
-            </w:r>
-            <w:proofErr w:type="spellEnd"/>
-            <w:r>
-              <w:rPr>
-                <w:rStyle w:val="fontstyle01"/>
-                <w:rFonts w:ascii="Arial" w:hAnsi="Arial"/>
-                <w:b w:val="0"/>
-                <w:bCs/>
-                <w:color w:val="auto"/>
-              </w:rPr>
-              <w:t xml:space="preserve"> para bienes ambientales y/o recursos naturales de acuerdo con la normativa vigente.</w:t>
+              <w:t>Aplicar metodologías valuatorias para bienes ambientales y/o recursos naturales de acuerdo con la normativa vigente.</w:t>
             </w:r>
           </w:p>
         </w:tc>
@@ -1389,14 +1367,11 @@
       <w:r>
         <w:rPr>
           <w:rFonts w:eastAsia="Times New Roman"/>
-          <w:i/>
-          <w:iCs/>
-          <w:sz w:val="20"/>
-          <w:szCs w:val="20"/>
-          <w:highlight w:val="cyan"/>
+          <w:sz w:val="20"/>
+          <w:szCs w:val="20"/>
           <w:lang w:eastAsia="es-CO"/>
         </w:rPr>
-        <w:t>relax</w:t>
+        <w:t>relax,</w:t>
       </w:r>
       <w:r>
         <w:rPr>
@@ -1405,7 +1380,7 @@
           <w:szCs w:val="20"/>
           <w:lang w:eastAsia="es-CO"/>
         </w:rPr>
-        <w:t xml:space="preserve">, el descanso y el esparcimiento. Es un turismo de disfrute pasivo o recreativo sin necesidad de enfrentar desafíos físicos ni riesgos. Ejemplos típicos son viajes a playas, resorts, parques temáticos o cruceros. No necesariamente se asocia a la aventura ni a entornos naturales exigentes. </w:t>
+        <w:t xml:space="preserve"> el descanso y el esparcimiento. Es un turismo de disfrute pasivo o recreativo sin necesidad de enfrentar desafíos físicos ni riesgos. Ejemplos típicos son viajes a playas, resorts, parques temáticos o cruceros. No necesariamente se asocia a la aventura ni a entornos naturales exigentes. </w:t>
       </w:r>
     </w:p>
     <w:p>
@@ -3201,7 +3176,27 @@
           <w:szCs w:val="20"/>
           <w:lang w:eastAsia="es-CO"/>
         </w:rPr>
-        <w:t>Transformación hacia una mono economía: el turismo puede llevar a una excesiva dependencia de este sector, lo que podría hacer que el destino se vuelva vulnerable a cambios en la demanda turística y pierda diversificación económica.</w:t>
+        <w:t xml:space="preserve">Transformación hacia una </w:t>
+      </w:r>
+      <w:proofErr w:type="spellStart"/>
+      <w:r>
+        <w:rPr>
+          <w:rFonts w:eastAsia="Times New Roman"/>
+          <w:sz w:val="20"/>
+          <w:szCs w:val="20"/>
+          <w:lang w:eastAsia="es-CO"/>
+        </w:rPr>
+        <w:t>monoeconomía</w:t>
+      </w:r>
+      <w:proofErr w:type="spellEnd"/>
+      <w:r>
+        <w:rPr>
+          <w:rFonts w:eastAsia="Times New Roman"/>
+          <w:sz w:val="20"/>
+          <w:szCs w:val="20"/>
+          <w:lang w:eastAsia="es-CO"/>
+        </w:rPr>
+        <w:t>: el turismo puede llevar a una excesiva dependencia de este sector, lo que podría hacer que el destino se vuelva vulnerable a cambios en la demanda turística y pierda diversificación económica.</w:t>
       </w:r>
     </w:p>
     <w:p>
@@ -4344,7 +4339,25 @@
           <w:sz w:val="20"/>
           <w:szCs w:val="20"/>
         </w:rPr>
-        <w:t>Capacidad de Carga</w:t>
+        <w:t xml:space="preserve">Capacidad de </w:t>
+      </w:r>
+      <w:r>
+        <w:rPr>
+          <w:b/>
+          <w:bCs/>
+          <w:sz w:val="20"/>
+          <w:szCs w:val="20"/>
+        </w:rPr>
+        <w:t>c</w:t>
+      </w:r>
+      <w:r>
+        <w:rPr>
+          <w:b/>
+          <w:bCs/>
+          <w:sz w:val="20"/>
+          <w:szCs w:val="20"/>
+        </w:rPr>
+        <w:t>arga</w:t>
       </w:r>
     </w:p>
     <w:p>
@@ -4816,14 +4829,28 @@
           <w:sz w:val="20"/>
           <w:szCs w:val="20"/>
         </w:rPr>
-        <w:t xml:space="preserve">Uno de los principales motores de cambio en el uso del suelo en Colombia es la expansión de la ganadería, que ha llevado a la deforestación de grandes extensiones de bosques nativos, especialmente en los bosques secos, los bosques andinos y las selvas tropicales húmedas. La región amazónica y el </w:t>
-      </w:r>
-      <w:r>
-        <w:rPr>
-          <w:sz w:val="20"/>
-          <w:szCs w:val="20"/>
-        </w:rPr>
-        <w:t>p</w:t>
+        <w:t xml:space="preserve">Uno de los principales motores de cambio en el uso del suelo en Colombia es la expansión de la ganadería, que ha llevado a la deforestación de grandes extensiones de bosques nativos, especialmente en los bosques secos, los bosques andinos y las selvas tropicales húmedas. La región </w:t>
+      </w:r>
+      <w:r>
+        <w:rPr>
+          <w:sz w:val="20"/>
+          <w:szCs w:val="20"/>
+        </w:rPr>
+        <w:t>A</w:t>
+      </w:r>
+      <w:r>
+        <w:rPr>
+          <w:sz w:val="20"/>
+          <w:szCs w:val="20"/>
+        </w:rPr>
+        <w:t xml:space="preserve">mazónica y el </w:t>
+      </w:r>
+      <w:r>
+        <w:rPr>
+          <w:sz w:val="20"/>
+          <w:szCs w:val="20"/>
+        </w:rPr>
+        <w:t>P</w:t>
       </w:r>
       <w:r>
         <w:rPr>
@@ -8511,7 +8538,7 @@
                 <v:stroke joinstyle="miter"/>
                 <v:path gradientshapeok="t" o:connecttype="rect"/>
               </v:shapetype>
-              <v:shape id="Cuadro de texto 1" o:spid="_x0000_s1026" type="#_x0000_t202" style="position:absolute;margin-left:126.65pt;margin-top:161.7pt;width:215.15pt;height:21.05pt;z-index:251668480;visibility:visible;mso-wrap-style:square;mso-width-percent:0;mso-height-percent:0;mso-wrap-distance-left:9pt;mso-wrap-distance-top:0;mso-wrap-distance-right:9pt;mso-wrap-distance-bottom:0;mso-position-horizontal:absolute;mso-position-horizontal-relative:text;mso-position-vertical:absolute;mso-position-vertical-relative:text;mso-width-percent:0;mso-height-percent:0;mso-width-relative:margin;mso-height-relative:margin;v-text-anchor:top" o:gfxdata="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" filled="f" stroked="f">
+              <v:shape id="Cuadro de texto 1" o:spid="_x0000_s1027" type="#_x0000_t202" style="position:absolute;margin-left:126.65pt;margin-top:161.7pt;width:215.15pt;height:21.05pt;z-index:251668480;visibility:visible;mso-wrap-style:square;mso-width-percent:0;mso-height-percent:0;mso-wrap-distance-left:9pt;mso-wrap-distance-top:0;mso-wrap-distance-right:9pt;mso-wrap-distance-bottom:0;mso-position-horizontal:absolute;mso-position-horizontal-relative:text;mso-position-vertical:absolute;mso-position-vertical-relative:text;mso-width-percent:0;mso-height-percent:0;mso-width-relative:margin;mso-height-relative:margin;v-text-anchor:top" o:gfxdata="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" filled="f" stroked="f">
                 <v:textbox>
                   <w:txbxContent>
                     <w:p>
@@ -14430,7 +14457,7 @@
           <w:sz w:val="20"/>
           <w:szCs w:val="20"/>
         </w:rPr>
-        <w:t>l.</w:t>
+        <w:t>l</w:t>
       </w:r>
       <w:r>
         <w:rPr>
@@ -14822,17 +14849,29 @@
           <w:sz w:val="20"/>
           <w:szCs w:val="20"/>
         </w:rPr>
-        <w:t>(</w:t>
-      </w:r>
-      <w:proofErr w:type="spellStart"/>
-      <w:r>
-        <w:rPr>
-          <w:sz w:val="20"/>
-          <w:szCs w:val="20"/>
-        </w:rPr>
-        <w:t>sf</w:t>
-      </w:r>
-      <w:proofErr w:type="spellEnd"/>
+        <w:t>(s</w:t>
+      </w:r>
+      <w:r>
+        <w:rPr>
+          <w:sz w:val="20"/>
+          <w:szCs w:val="20"/>
+        </w:rPr>
+        <w:t>.</w:t>
+      </w:r>
+      <w:r>
+        <w:rPr>
+          <w:sz w:val="20"/>
+          <w:szCs w:val="20"/>
+        </w:rPr>
+        <w:t>f</w:t>
+      </w:r>
+      <w:r>
+        <w:rPr>
+          <w:sz w:val="20"/>
+          <w:szCs w:val="20"/>
+        </w:rPr>
+        <w:t>.</w:t>
+      </w:r>
       <w:r>
         <w:rPr>
           <w:sz w:val="20"/>
@@ -15212,7 +15251,15 @@
           <w:sz w:val="20"/>
           <w:szCs w:val="20"/>
         </w:rPr>
-        <w:t>TURISMO:</w:t>
+        <w:t>TURISMO</w:t>
+      </w:r>
+      <w:r>
+        <w:rPr>
+          <w:i/>
+          <w:sz w:val="20"/>
+          <w:szCs w:val="20"/>
+        </w:rPr>
+        <w:t>.</w:t>
       </w:r>
       <w:r>
         <w:rPr>
@@ -16258,7 +16305,21 @@
                 <w:sz w:val="20"/>
                 <w:szCs w:val="20"/>
               </w:rPr>
-              <w:t>Evaluadora Instruccional</w:t>
+              <w:t xml:space="preserve">Evaluadora </w:t>
+            </w:r>
+            <w:r>
+              <w:rPr>
+                <w:sz w:val="20"/>
+                <w:szCs w:val="20"/>
+              </w:rPr>
+              <w:t>i</w:t>
+            </w:r>
+            <w:r>
+              <w:rPr>
+                <w:sz w:val="20"/>
+                <w:szCs w:val="20"/>
+              </w:rPr>
+              <w:t>nstruccional</w:t>
             </w:r>
           </w:p>
         </w:tc>
@@ -24091,21 +24152,12 @@
 </file>
 
 <file path=customXml/item1.xml><?xml version="1.0" encoding="utf-8"?>
-<?mso-contentType ?>
-<FormTemplates xmlns="http://schemas.microsoft.com/sharepoint/v3/contenttype/forms">
-  <Display>DocumentLibraryForm</Display>
-  <Edit>DocumentLibraryForm</Edit>
-  <New>DocumentLibraryForm</New>
-</FormTemplates>
-</file>
-
-<file path=customXml/item2.xml><?xml version="1.0" encoding="utf-8"?>
 <go:gDocsCustomXmlDataStorage xmlns:go="http://customooxmlschemas.google.com/" xmlns:r="http://schemas.openxmlformats.org/officeDocument/2006/relationships">
   <go:docsCustomData xmlns:go="http://customooxmlschemas.google.com/" roundtripDataSignature="AMtx7mh3w1sXrKwdjzYCxjbwPkf7wsIk5w==">AMUW2mWhRc/xLonLdtoI8dz4BVu2GREgE7++Eme5Ko+W5/2G+QfXPKxV7NwLPPaJ77IM2LrlHDguxVZnDKcg4iQIvJIe+zJ9DBWjUaWFI+z0k4HbdiCFsJo=</go:docsCustomData>
 </go:gDocsCustomXmlDataStorage>
 </file>
 
-<file path=customXml/item3.xml><?xml version="1.0" encoding="utf-8"?>
+<file path=customXml/item2.xml><?xml version="1.0" encoding="utf-8"?>
 <p:properties xmlns:p="http://schemas.microsoft.com/office/2006/metadata/properties" xmlns:xsi="http://www.w3.org/2001/XMLSchema-instance" xmlns:pc="http://schemas.microsoft.com/office/infopath/2007/PartnerControls">
   <documentManagement>
     <TaxCatchAll xmlns="cb45339b-ced9-4d0d-8f64-77573914d53b" xsi:nil="true"/>
@@ -24114,6 +24166,15 @@
     </lcf76f155ced4ddcb4097134ff3c332f>
   </documentManagement>
 </p:properties>
+</file>
+
+<file path=customXml/item3.xml><?xml version="1.0" encoding="utf-8"?>
+<?mso-contentType ?>
+<FormTemplates xmlns="http://schemas.microsoft.com/sharepoint/v3/contenttype/forms">
+  <Display>DocumentLibraryForm</Display>
+  <Edit>DocumentLibraryForm</Edit>
+  <New>DocumentLibraryForm</New>
+</FormTemplates>
 </file>
 
 <file path=customXml/item4.xml><?xml version="1.0" encoding="utf-8"?>
@@ -24352,14 +24413,6 @@
 </file>
 
 <file path=customXml/itemProps1.xml><?xml version="1.0" encoding="utf-8"?>
-<ds:datastoreItem xmlns:ds="http://schemas.openxmlformats.org/officeDocument/2006/customXml" ds:itemID="{83102ECF-E44F-4F73-A78F-FE313D1BFB9A}">
-  <ds:schemaRefs>
-    <ds:schemaRef ds:uri="http://schemas.microsoft.com/sharepoint/v3/contenttype/forms"/>
-  </ds:schemaRefs>
-</ds:datastoreItem>
-</file>
-
-<file path=customXml/itemProps2.xml><?xml version="1.0" encoding="utf-8"?>
 <ds:datastoreItem xmlns:ds="http://schemas.openxmlformats.org/officeDocument/2006/customXml" ds:itemID="{11111111-1234-1234-1234-123412341234}">
   <ds:schemaRefs>
     <ds:schemaRef ds:uri="http://customooxmlschemas.google.com/"/>
@@ -24368,7 +24421,7 @@
 </ds:datastoreItem>
 </file>
 
-<file path=customXml/itemProps3.xml><?xml version="1.0" encoding="utf-8"?>
+<file path=customXml/itemProps2.xml><?xml version="1.0" encoding="utf-8"?>
 <ds:datastoreItem xmlns:ds="http://schemas.openxmlformats.org/officeDocument/2006/customXml" ds:itemID="{9D9B1A75-0210-4935-8179-95DF20A26AD1}">
   <ds:schemaRefs>
     <ds:schemaRef ds:uri="http://schemas.microsoft.com/office/2006/metadata/properties"/>
@@ -24379,6 +24432,14 @@
 </ds:datastoreItem>
 </file>
 
+<file path=customXml/itemProps3.xml><?xml version="1.0" encoding="utf-8"?>
+<ds:datastoreItem xmlns:ds="http://schemas.openxmlformats.org/officeDocument/2006/customXml" ds:itemID="{83102ECF-E44F-4F73-A78F-FE313D1BFB9A}">
+  <ds:schemaRefs>
+    <ds:schemaRef ds:uri="http://schemas.microsoft.com/sharepoint/v3/contenttype/forms"/>
+  </ds:schemaRefs>
+</ds:datastoreItem>
+</file>
+
 <file path=customXml/itemProps4.xml><?xml version="1.0" encoding="utf-8"?>
-<ds:datastoreItem xmlns:ds="http://schemas.openxmlformats.org/officeDocument/2006/customXml" ds:itemID="{1D8AB178-F2F8-459D-B41A-8CCDE39CE977}"/>
+<ds:datastoreItem xmlns:ds="http://schemas.openxmlformats.org/officeDocument/2006/customXml" ds:itemID="{F0B60D1A-217C-4E64-961B-A09F380B8181}"/>
 </file>
</xml_diff>